<commit_message>
content: actualizar anuncios segun documento revisado (MOP y Sotaqui)
Co-authored-by: Cursor <cursoragent@cursor.com>
</commit_message>
<xml_diff>
--- a/Secciones boletín informativo.docx
+++ b/Secciones boletín informativo.docx
@@ -29,6 +29,7 @@
           <w:ilvl w:val="0"/>
           <w:numId w:val="1"/>
         </w:numPr>
+        <w:jc w:val="both"/>
         <w:rPr>
           <w:b/>
           <w:bCs/>
@@ -92,7 +93,7 @@
                     <pic:cNvPicPr/>
                   </pic:nvPicPr>
                   <pic:blipFill>
-                    <a:blip r:embed="rId5">
+                    <a:blip r:embed="rId7">
                       <a:extLst>
                         <a:ext uri="{28A0092B-C50C-407E-A947-70E740481C1C}">
                           <a14:useLocalDpi xmlns:a14="http://schemas.microsoft.com/office/drawing/2010/main" val="0"/>
@@ -121,6 +122,7 @@
     </w:p>
     <w:p>
       <w:pPr>
+        <w:jc w:val="both"/>
         <w:rPr>
           <w:lang w:val="es-MX"/>
         </w:rPr>
@@ -151,6 +153,7 @@
           <w:ilvl w:val="0"/>
           <w:numId w:val="1"/>
         </w:numPr>
+        <w:jc w:val="both"/>
         <w:rPr>
           <w:lang w:val="es-MX"/>
         </w:rPr>
@@ -192,7 +195,7 @@
                     <pic:cNvPicPr/>
                   </pic:nvPicPr>
                   <pic:blipFill>
-                    <a:blip r:embed="rId6">
+                    <a:blip r:embed="rId8">
                       <a:extLst>
                         <a:ext uri="{28A0092B-C50C-407E-A947-70E740481C1C}">
                           <a14:useLocalDpi xmlns:a14="http://schemas.microsoft.com/office/drawing/2010/main" val="0"/>
@@ -221,6 +224,7 @@
     </w:p>
     <w:p>
       <w:pPr>
+        <w:jc w:val="both"/>
         <w:rPr>
           <w:lang w:val="es-MX"/>
         </w:rPr>
@@ -270,6 +274,7 @@
           <w:ilvl w:val="0"/>
           <w:numId w:val="1"/>
         </w:numPr>
+        <w:jc w:val="both"/>
         <w:rPr>
           <w:b/>
           <w:bCs/>
@@ -333,7 +338,7 @@
                     <pic:cNvPicPr/>
                   </pic:nvPicPr>
                   <pic:blipFill>
-                    <a:blip r:embed="rId7">
+                    <a:blip r:embed="rId9">
                       <a:extLst>
                         <a:ext uri="{28A0092B-C50C-407E-A947-70E740481C1C}">
                           <a14:useLocalDpi xmlns:a14="http://schemas.microsoft.com/office/drawing/2010/main" val="0"/>
@@ -362,6 +367,7 @@
     </w:p>
     <w:p>
       <w:pPr>
+        <w:jc w:val="both"/>
         <w:rPr>
           <w:i/>
           <w:iCs/>
@@ -444,6 +450,7 @@
           <w:ilvl w:val="0"/>
           <w:numId w:val="1"/>
         </w:numPr>
+        <w:jc w:val="both"/>
         <w:rPr>
           <w:b/>
           <w:bCs/>
@@ -481,7 +488,7 @@
                     <pic:cNvPicPr/>
                   </pic:nvPicPr>
                   <pic:blipFill>
-                    <a:blip r:embed="rId8" cstate="print">
+                    <a:blip r:embed="rId10" cstate="print">
                       <a:extLst>
                         <a:ext uri="{28A0092B-C50C-407E-A947-70E740481C1C}">
                           <a14:useLocalDpi xmlns:a14="http://schemas.microsoft.com/office/drawing/2010/main" val="0"/>
@@ -544,7 +551,7 @@
                     <pic:cNvPicPr/>
                   </pic:nvPicPr>
                   <pic:blipFill>
-                    <a:blip r:embed="rId9" cstate="print">
+                    <a:blip r:embed="rId11" cstate="print">
                       <a:extLst>
                         <a:ext uri="{28A0092B-C50C-407E-A947-70E740481C1C}">
                           <a14:useLocalDpi xmlns:a14="http://schemas.microsoft.com/office/drawing/2010/main" val="0"/>
@@ -587,15 +594,17 @@
     </w:p>
     <w:p>
       <w:pPr>
-        <w:rPr>
-          <w:b/>
-          <w:bCs/>
-          <w:lang w:val="es-MX"/>
-        </w:rPr>
-      </w:pPr>
-    </w:p>
-    <w:p>
-      <w:pPr>
+        <w:jc w:val="both"/>
+        <w:rPr>
+          <w:b/>
+          <w:bCs/>
+          <w:lang w:val="es-MX"/>
+        </w:rPr>
+      </w:pPr>
+    </w:p>
+    <w:p>
+      <w:pPr>
+        <w:jc w:val="both"/>
         <w:rPr>
           <w:lang w:val="es-MX"/>
         </w:rPr>
@@ -605,7 +614,21 @@
           <w:lang w:val="es-MX"/>
         </w:rPr>
         <w:lastRenderedPageBreak/>
-        <w:t>La localidad de Sotaquí se prepara para recibir a toda la comunidad en</w:t>
+        <w:t xml:space="preserve">La localidad de </w:t>
+      </w:r>
+      <w:proofErr w:type="spellStart"/>
+      <w:r>
+        <w:rPr>
+          <w:lang w:val="es-MX"/>
+        </w:rPr>
+        <w:t>Sotaquí</w:t>
+      </w:r>
+      <w:proofErr w:type="spellEnd"/>
+      <w:r>
+        <w:rPr>
+          <w:lang w:val="es-MX"/>
+        </w:rPr>
+        <w:t xml:space="preserve"> se prepara para recibir a toda la comunidad en</w:t>
       </w:r>
       <w:r>
         <w:rPr>
@@ -652,6 +675,7 @@
     </w:p>
     <w:p>
       <w:pPr>
+        <w:jc w:val="both"/>
         <w:rPr>
           <w:lang w:val="es-MX"/>
         </w:rPr>
@@ -670,17 +694,20 @@
           <w:ilvl w:val="0"/>
           <w:numId w:val="1"/>
         </w:numPr>
-        <w:rPr>
-          <w:lang w:val="es-MX"/>
-        </w:rPr>
-      </w:pPr>
-      <w:r>
-        <w:rPr>
-          <w:b/>
-          <w:bCs/>
-          <w:lang w:val="es-MX"/>
-        </w:rPr>
-        <w:t>SEPTIEMBRE INICIA CON NUEVAS FECHAS DE ESTERILIZACIÓN DE MASCOTAS</w:t>
+        <w:jc w:val="both"/>
+        <w:rPr>
+          <w:b/>
+          <w:bCs/>
+          <w:lang w:val="es-MX"/>
+        </w:rPr>
+      </w:pPr>
+      <w:r>
+        <w:rPr>
+          <w:b/>
+          <w:bCs/>
+          <w:lang w:val="es-MX"/>
+        </w:rPr>
+        <w:t>Municipio de Ovalle y MOP comprometen soluciones para conectividad, agua potable y seguridad ante lluvias en sectores rurales</w:t>
       </w:r>
     </w:p>
     <w:p>
@@ -696,10 +723,10 @@
           <w:lang w:val="es-MX"/>
         </w:rPr>
         <w:drawing>
-          <wp:inline distT="0" distB="0" distL="0" distR="0" wp14:anchorId="64CA3FC5" wp14:editId="63A40075">
-            <wp:extent cx="2466975" cy="3082741"/>
-            <wp:effectExtent l="0" t="0" r="0" b="3810"/>
-            <wp:docPr id="1" name="Imagen 1"/>
+          <wp:inline distT="0" distB="0" distL="0" distR="0" wp14:anchorId="174E9E35" wp14:editId="7F6D5465">
+            <wp:extent cx="2793296" cy="2038350"/>
+            <wp:effectExtent l="0" t="0" r="7620" b="0"/>
+            <wp:docPr id="2" name="Imagen 2"/>
             <wp:cNvGraphicFramePr>
               <a:graphicFrameLocks xmlns:a="http://schemas.openxmlformats.org/drawingml/2006/main" noChangeAspect="1"/>
             </wp:cNvGraphicFramePr>
@@ -707,11 +734,11 @@
               <a:graphicData uri="http://schemas.openxmlformats.org/drawingml/2006/picture">
                 <pic:pic xmlns:pic="http://schemas.openxmlformats.org/drawingml/2006/picture">
                   <pic:nvPicPr>
-                    <pic:cNvPr id="1" name="Imagen 1"/>
+                    <pic:cNvPr id="2" name="Imagen 2"/>
                     <pic:cNvPicPr/>
                   </pic:nvPicPr>
                   <pic:blipFill>
-                    <a:blip r:embed="rId10" cstate="print">
+                    <a:blip r:embed="rId12">
                       <a:extLst>
                         <a:ext uri="{28A0092B-C50C-407E-A947-70E740481C1C}">
                           <a14:useLocalDpi xmlns:a14="http://schemas.microsoft.com/office/drawing/2010/main" val="0"/>
@@ -725,7 +752,7 @@
                   <pic:spPr>
                     <a:xfrm>
                       <a:off x="0" y="0"/>
-                      <a:ext cx="2475805" cy="3093776"/>
+                      <a:ext cx="2800462" cy="2043580"/>
                     </a:xfrm>
                     <a:prstGeom prst="rect">
                       <a:avLst/>
@@ -740,40 +767,42 @@
     </w:p>
     <w:p>
       <w:pPr>
-        <w:rPr>
-          <w:lang w:val="es-MX"/>
-        </w:rPr>
-      </w:pPr>
-      <w:r>
-        <w:rPr>
-          <w:lang w:val="es-MX"/>
-        </w:rPr>
-        <w:t xml:space="preserve">Nuevos operativos gratuitos de esterilización se realizarán durante el mes de septiembre en distintos puntos de la comuna, </w:t>
-      </w:r>
-      <w:r>
-        <w:rPr>
-          <w:lang w:val="es-MX"/>
-        </w:rPr>
-        <w:t>en la que, para participar, debes inscribirte previamente a través de la junta de vecinos de tu localidad.</w:t>
-      </w:r>
-    </w:p>
-    <w:p>
-      <w:pPr>
-        <w:rPr>
-          <w:lang w:val="es-MX"/>
-        </w:rPr>
-      </w:pPr>
-      <w:r>
-        <w:rPr>
-          <w:lang w:val="es-MX"/>
-        </w:rPr>
-        <w:t xml:space="preserve">Revisa el calendario con </w:t>
-      </w:r>
-      <w:r>
-        <w:rPr>
-          <w:lang w:val="es-MX"/>
-        </w:rPr>
-        <w:t>fechas y sectores beneficiados en las redes sociales del municipio.</w:t>
+        <w:jc w:val="both"/>
+        <w:rPr>
+          <w:lang w:val="es-MX"/>
+        </w:rPr>
+      </w:pPr>
+      <w:r>
+        <w:rPr>
+          <w:lang w:val="es-MX"/>
+        </w:rPr>
+        <w:t xml:space="preserve">El alcalde de Ovalle, Héctor Vega Campusano, junto al seremi de Obras Públicas de la región de Coquimbo, Cristian </w:t>
+      </w:r>
+      <w:proofErr w:type="spellStart"/>
+      <w:r>
+        <w:rPr>
+          <w:lang w:val="es-MX"/>
+        </w:rPr>
+        <w:t>Smitmans</w:t>
+      </w:r>
+      <w:proofErr w:type="spellEnd"/>
+      <w:r>
+        <w:rPr>
+          <w:lang w:val="es-MX"/>
+        </w:rPr>
+        <w:t>, recorrieron las localidades de Aromos de Tabali, El Trapiche y Estación Recoleta</w:t>
+      </w:r>
+      <w:r>
+        <w:rPr>
+          <w:lang w:val="es-MX"/>
+        </w:rPr>
+        <w:t xml:space="preserve"> con el objetivo de conocer</w:t>
+      </w:r>
+      <w:r>
+        <w:rPr>
+          <w:lang w:val="es-MX"/>
+        </w:rPr>
+        <w:t xml:space="preserve"> directamente las principales problemáticas que afectan a sus comunidades.</w:t>
       </w:r>
     </w:p>
     <w:p>
@@ -783,17 +812,20 @@
           <w:ilvl w:val="0"/>
           <w:numId w:val="1"/>
         </w:numPr>
-        <w:rPr>
-          <w:lang w:val="es-MX"/>
-        </w:rPr>
-      </w:pPr>
-      <w:r>
-        <w:rPr>
-          <w:b/>
-          <w:bCs/>
-          <w:lang w:val="es-MX"/>
-        </w:rPr>
-        <w:t>CAMBIO AL HORARIO DE VERANO ESTE SÁBADO 5 DE SEPTIEMBRE</w:t>
+        <w:jc w:val="both"/>
+        <w:rPr>
+          <w:b/>
+          <w:bCs/>
+          <w:lang w:val="es-MX"/>
+        </w:rPr>
+      </w:pPr>
+      <w:r>
+        <w:rPr>
+          <w:b/>
+          <w:bCs/>
+          <w:lang w:val="es-MX"/>
+        </w:rPr>
+        <w:t>Cambio al horario de verano este sábado 5 de septiembre</w:t>
       </w:r>
     </w:p>
     <w:p>
@@ -808,7 +840,6 @@
           <w:noProof/>
           <w:lang w:val="es-MX"/>
         </w:rPr>
-        <w:lastRenderedPageBreak/>
         <w:drawing>
           <wp:inline distT="0" distB="0" distL="0" distR="0" wp14:anchorId="6FF41EC6" wp14:editId="296768A8">
             <wp:extent cx="2181225" cy="2725669"/>
@@ -825,7 +856,7 @@
                     <pic:cNvPicPr/>
                   </pic:nvPicPr>
                   <pic:blipFill>
-                    <a:blip r:embed="rId11" cstate="print">
+                    <a:blip r:embed="rId13" cstate="print">
                       <a:extLst>
                         <a:ext uri="{28A0092B-C50C-407E-A947-70E740481C1C}">
                           <a14:useLocalDpi xmlns:a14="http://schemas.microsoft.com/office/drawing/2010/main" val="0"/>
@@ -854,6 +885,7 @@
     </w:p>
     <w:p>
       <w:pPr>
+        <w:jc w:val="both"/>
         <w:rPr>
           <w:lang w:val="es-MX"/>
         </w:rPr>
@@ -894,6 +926,7 @@
           <w:u w:val="single"/>
           <w:lang w:val="es-MX"/>
         </w:rPr>
+        <w:lastRenderedPageBreak/>
         <w:t>NOTICIAS DE INTERÉ</w:t>
       </w:r>
       <w:r>
@@ -913,6 +946,7 @@
           <w:ilvl w:val="0"/>
           <w:numId w:val="1"/>
         </w:numPr>
+        <w:jc w:val="both"/>
       </w:pPr>
       <w:r>
         <w:rPr>
@@ -923,7 +957,10 @@
       </w:r>
     </w:p>
     <w:p>
-      <w:hyperlink r:id="rId12" w:history="1">
+      <w:pPr>
+        <w:jc w:val="both"/>
+      </w:pPr>
+      <w:hyperlink r:id="rId14" w:history="1">
         <w:r>
           <w:rPr>
             <w:rStyle w:val="Hipervnculo"/>
@@ -956,7 +993,7 @@
                     <pic:cNvPicPr/>
                   </pic:nvPicPr>
                   <pic:blipFill>
-                    <a:blip r:embed="rId13">
+                    <a:blip r:embed="rId15">
                       <a:extLst>
                         <a:ext uri="{28A0092B-C50C-407E-A947-70E740481C1C}">
                           <a14:useLocalDpi xmlns:a14="http://schemas.microsoft.com/office/drawing/2010/main" val="0"/>
@@ -990,6 +1027,7 @@
           <w:ilvl w:val="0"/>
           <w:numId w:val="1"/>
         </w:numPr>
+        <w:jc w:val="both"/>
       </w:pPr>
       <w:r>
         <w:rPr>
@@ -1000,7 +1038,10 @@
       </w:r>
     </w:p>
     <w:p>
-      <w:hyperlink r:id="rId14" w:history="1">
+      <w:pPr>
+        <w:jc w:val="both"/>
+      </w:pPr>
+      <w:hyperlink r:id="rId16" w:history="1">
         <w:r>
           <w:rPr>
             <w:rStyle w:val="Hipervnculo"/>
@@ -1017,7 +1058,6 @@
         <w:rPr>
           <w:noProof/>
         </w:rPr>
-        <w:lastRenderedPageBreak/>
         <w:drawing>
           <wp:inline distT="0" distB="0" distL="0" distR="0" wp14:anchorId="106EA014" wp14:editId="6F8DE046">
             <wp:extent cx="2114551" cy="1543050"/>
@@ -1034,7 +1074,7 @@
                     <pic:cNvPicPr/>
                   </pic:nvPicPr>
                   <pic:blipFill>
-                    <a:blip r:embed="rId15">
+                    <a:blip r:embed="rId17">
                       <a:extLst>
                         <a:ext uri="{28A0092B-C50C-407E-A947-70E740481C1C}">
                           <a14:useLocalDpi xmlns:a14="http://schemas.microsoft.com/office/drawing/2010/main" val="0"/>
@@ -1068,6 +1108,7 @@
           <w:ilvl w:val="0"/>
           <w:numId w:val="1"/>
         </w:numPr>
+        <w:jc w:val="both"/>
       </w:pPr>
       <w:r>
         <w:rPr>
@@ -1078,7 +1119,10 @@
       </w:r>
     </w:p>
     <w:p>
-      <w:hyperlink r:id="rId16" w:history="1">
+      <w:pPr>
+        <w:jc w:val="both"/>
+      </w:pPr>
+      <w:hyperlink r:id="rId18" w:history="1">
         <w:r>
           <w:rPr>
             <w:rStyle w:val="Hipervnculo"/>
@@ -1111,7 +1155,7 @@
                     <pic:cNvPicPr/>
                   </pic:nvPicPr>
                   <pic:blipFill>
-                    <a:blip r:embed="rId17">
+                    <a:blip r:embed="rId19">
                       <a:extLst>
                         <a:ext uri="{28A0092B-C50C-407E-A947-70E740481C1C}">
                           <a14:useLocalDpi xmlns:a14="http://schemas.microsoft.com/office/drawing/2010/main" val="0"/>
@@ -1146,6 +1190,56 @@
     </w:sectPr>
   </w:body>
 </w:document>
+</file>
+
+<file path=word/endnotes.xml><?xml version="1.0" encoding="utf-8"?>
+<w:endnotes xmlns:wpc="http://schemas.microsoft.com/office/word/2010/wordprocessingCanvas" xmlns:cx="http://schemas.microsoft.com/office/drawing/2014/chartex" xmlns:cx1="http://schemas.microsoft.com/office/drawing/2015/9/8/chartex" xmlns:cx2="http://schemas.microsoft.com/office/drawing/2015/10/21/chartex" xmlns:cx3="http://schemas.microsoft.com/office/drawing/2016/5/9/chartex" xmlns:cx4="http://schemas.microsoft.com/office/drawing/2016/5/10/chartex" xmlns:cx5="http://schemas.microsoft.com/office/drawing/2016/5/11/chartex" xmlns:cx6="http://schemas.microsoft.com/office/drawing/2016/5/12/chartex" xmlns:cx7="http://schemas.microsoft.com/office/drawing/2016/5/13/chartex" xmlns:cx8="http://schemas.microsoft.com/office/drawing/2016/5/14/chartex" xmlns:mc="http://schemas.openxmlformats.org/markup-compatibility/2006" xmlns:aink="http://schemas.microsoft.com/office/drawing/2016/ink" xmlns:am3d="http://schemas.microsoft.com/office/drawing/2017/model3d" xmlns:o="urn:schemas-microsoft-com:office:office" xmlns:oel="http://schemas.microsoft.com/office/2019/extlst" xmlns:r="http://schemas.openxmlformats.org/officeDocument/2006/relationships" xmlns:m="http://schemas.openxmlformats.org/officeDocument/2006/math" xmlns:v="urn:schemas-microsoft-com:vml" xmlns:wp14="http://schemas.microsoft.com/office/word/2010/wordprocessingDrawing" xmlns:wp="http://schemas.openxmlformats.org/drawingml/2006/wordprocessingDrawing" xmlns:w10="urn:schemas-microsoft-com:office:word" xmlns:w="http://schemas.openxmlformats.org/wordprocessingml/2006/main" xmlns:w14="http://schemas.microsoft.com/office/word/2010/wordml" xmlns:w15="http://schemas.microsoft.com/office/word/2012/wordml" xmlns:w16cex="http://schemas.microsoft.com/office/word/2018/wordml/cex" xmlns:w16cid="http://schemas.microsoft.com/office/word/2016/wordml/cid" xmlns:w16="http://schemas.microsoft.com/office/word/2018/wordml" xmlns:w16sdtdh="http://schemas.microsoft.com/office/word/2020/wordml/sdtdatahash" xmlns:w16se="http://schemas.microsoft.com/office/word/2015/wordml/symex" xmlns:wpg="http://schemas.microsoft.com/office/word/2010/wordprocessingGroup" xmlns:wpi="http://schemas.microsoft.com/office/word/2010/wordprocessingInk" xmlns:wne="http://schemas.microsoft.com/office/word/2006/wordml" xmlns:wps="http://schemas.microsoft.com/office/word/2010/wordprocessingShape" mc:Ignorable="w14 w15 w16se w16cid w16 w16cex w16sdtdh wp14">
+  <w:endnote w:type="separator" w:id="-1">
+    <w:p>
+      <w:pPr>
+        <w:spacing w:after="0" w:line="240" w:lineRule="auto"/>
+      </w:pPr>
+      <w:r>
+        <w:separator/>
+      </w:r>
+    </w:p>
+  </w:endnote>
+  <w:endnote w:type="continuationSeparator" w:id="0">
+    <w:p>
+      <w:pPr>
+        <w:spacing w:after="0" w:line="240" w:lineRule="auto"/>
+      </w:pPr>
+      <w:r>
+        <w:continuationSeparator/>
+      </w:r>
+    </w:p>
+  </w:endnote>
+</w:endnotes>
+</file>
+
+<file path=word/footnotes.xml><?xml version="1.0" encoding="utf-8"?>
+<w:footnotes xmlns:wpc="http://schemas.microsoft.com/office/word/2010/wordprocessingCanvas" xmlns:cx="http://schemas.microsoft.com/office/drawing/2014/chartex" xmlns:cx1="http://schemas.microsoft.com/office/drawing/2015/9/8/chartex" xmlns:cx2="http://schemas.microsoft.com/office/drawing/2015/10/21/chartex" xmlns:cx3="http://schemas.microsoft.com/office/drawing/2016/5/9/chartex" xmlns:cx4="http://schemas.microsoft.com/office/drawing/2016/5/10/chartex" xmlns:cx5="http://schemas.microsoft.com/office/drawing/2016/5/11/chartex" xmlns:cx6="http://schemas.microsoft.com/office/drawing/2016/5/12/chartex" xmlns:cx7="http://schemas.microsoft.com/office/drawing/2016/5/13/chartex" xmlns:cx8="http://schemas.microsoft.com/office/drawing/2016/5/14/chartex" xmlns:mc="http://schemas.openxmlformats.org/markup-compatibility/2006" xmlns:aink="http://schemas.microsoft.com/office/drawing/2016/ink" xmlns:am3d="http://schemas.microsoft.com/office/drawing/2017/model3d" xmlns:o="urn:schemas-microsoft-com:office:office" xmlns:oel="http://schemas.microsoft.com/office/2019/extlst" xmlns:r="http://schemas.openxmlformats.org/officeDocument/2006/relationships" xmlns:m="http://schemas.openxmlformats.org/officeDocument/2006/math" xmlns:v="urn:schemas-microsoft-com:vml" xmlns:wp14="http://schemas.microsoft.com/office/word/2010/wordprocessingDrawing" xmlns:wp="http://schemas.openxmlformats.org/drawingml/2006/wordprocessingDrawing" xmlns:w10="urn:schemas-microsoft-com:office:word" xmlns:w="http://schemas.openxmlformats.org/wordprocessingml/2006/main" xmlns:w14="http://schemas.microsoft.com/office/word/2010/wordml" xmlns:w15="http://schemas.microsoft.com/office/word/2012/wordml" xmlns:w16cex="http://schemas.microsoft.com/office/word/2018/wordml/cex" xmlns:w16cid="http://schemas.microsoft.com/office/word/2016/wordml/cid" xmlns:w16="http://schemas.microsoft.com/office/word/2018/wordml" xmlns:w16sdtdh="http://schemas.microsoft.com/office/word/2020/wordml/sdtdatahash" xmlns:w16se="http://schemas.microsoft.com/office/word/2015/wordml/symex" xmlns:wpg="http://schemas.microsoft.com/office/word/2010/wordprocessingGroup" xmlns:wpi="http://schemas.microsoft.com/office/word/2010/wordprocessingInk" xmlns:wne="http://schemas.microsoft.com/office/word/2006/wordml" xmlns:wps="http://schemas.microsoft.com/office/word/2010/wordprocessingShape" mc:Ignorable="w14 w15 w16se w16cid w16 w16cex w16sdtdh wp14">
+  <w:footnote w:type="separator" w:id="-1">
+    <w:p>
+      <w:pPr>
+        <w:spacing w:after="0" w:line="240" w:lineRule="auto"/>
+      </w:pPr>
+      <w:r>
+        <w:separator/>
+      </w:r>
+    </w:p>
+  </w:footnote>
+  <w:footnote w:type="continuationSeparator" w:id="0">
+    <w:p>
+      <w:pPr>
+        <w:spacing w:after="0" w:line="240" w:lineRule="auto"/>
+      </w:pPr>
+      <w:r>
+        <w:continuationSeparator/>
+      </w:r>
+    </w:p>
+  </w:footnote>
+</w:footnotes>
 </file>
 
 <file path=word/numbering.xml><?xml version="1.0" encoding="utf-8"?>
@@ -1740,6 +1834,50 @@
       <w:u w:val="single"/>
     </w:rPr>
   </w:style>
+  <w:style w:type="paragraph" w:styleId="Encabezado">
+    <w:name w:val="header"/>
+    <w:basedOn w:val="Normal"/>
+    <w:link w:val="EncabezadoCar"/>
+    <w:uiPriority w:val="99"/>
+    <w:unhideWhenUsed/>
+    <w:rsid w:val="00695999"/>
+    <w:pPr>
+      <w:tabs>
+        <w:tab w:val="center" w:pos="4419"/>
+        <w:tab w:val="right" w:pos="8838"/>
+      </w:tabs>
+      <w:spacing w:after="0" w:line="240" w:lineRule="auto"/>
+    </w:pPr>
+  </w:style>
+  <w:style w:type="character" w:customStyle="1" w:styleId="EncabezadoCar">
+    <w:name w:val="Encabezado Car"/>
+    <w:basedOn w:val="Fuentedeprrafopredeter"/>
+    <w:link w:val="Encabezado"/>
+    <w:uiPriority w:val="99"/>
+    <w:rsid w:val="00695999"/>
+  </w:style>
+  <w:style w:type="paragraph" w:styleId="Piedepgina">
+    <w:name w:val="footer"/>
+    <w:basedOn w:val="Normal"/>
+    <w:link w:val="PiedepginaCar"/>
+    <w:uiPriority w:val="99"/>
+    <w:unhideWhenUsed/>
+    <w:rsid w:val="00695999"/>
+    <w:pPr>
+      <w:tabs>
+        <w:tab w:val="center" w:pos="4419"/>
+        <w:tab w:val="right" w:pos="8838"/>
+      </w:tabs>
+      <w:spacing w:after="0" w:line="240" w:lineRule="auto"/>
+    </w:pPr>
+  </w:style>
+  <w:style w:type="character" w:customStyle="1" w:styleId="PiedepginaCar">
+    <w:name w:val="Pie de página Car"/>
+    <w:basedOn w:val="Fuentedeprrafopredeter"/>
+    <w:link w:val="Piedepgina"/>
+    <w:uiPriority w:val="99"/>
+    <w:rsid w:val="00695999"/>
+  </w:style>
 </w:styles>
 </file>
 

</xml_diff>